<commit_message>
solution to trigger mode not changing and test case bugs
</commit_message>
<xml_diff>
--- a/docs/teststand_bench_api-test-developer-guide.docx
+++ b/docs/teststand_bench_api-test-developer-guide.docx
@@ -2563,9 +2563,18 @@
     </w:p>
     <w:p>
       <w:r>
-        <w:t>Parameters and return values for the functions the use cases use. Full reference: the teststand_api (bench) User Manual.</w:t>
-      </w:r>
-    </w:p>
+        <w:t xml:space="preserve">Parameters and return values for the functions the use cases use. Full reference: the </w:t>
+      </w:r>
+      <w:proofErr w:type="spellStart"/>
+      <w:r>
+        <w:t>teststand_api</w:t>
+      </w:r>
+      <w:proofErr w:type="spellEnd"/>
+      <w:r>
+        <w:t xml:space="preserve"> (bench) User Manual.</w:t>
+      </w:r>
+    </w:p>
+    <w:p/>
     <w:p>
       <w:pPr>
         <w:pStyle w:val="Heading2"/>
@@ -2634,37 +2643,11 @@
         <w:rPr>
           <w:b/>
         </w:rPr>
+        <w:lastRenderedPageBreak/>
         <w:t xml:space="preserve">port </w:t>
       </w:r>
       <w:r>
         <w:t>(int) - SCPI port. Default 5025.</w:t>
-      </w:r>
-    </w:p>
-    <w:p>
-      <w:r>
-        <w:rPr>
-          <w:b/>
-        </w:rPr>
-        <w:lastRenderedPageBreak/>
-        <w:t xml:space="preserve">Returns: </w:t>
-      </w:r>
-      <w:r>
-        <w:t>str - the *IDN?, or "" if nothing matched.</w:t>
-      </w:r>
-    </w:p>
-    <w:p/>
-    <w:p>
-      <w:pPr>
-        <w:pStyle w:val="Mono"/>
-        <w:spacing w:after="40"/>
-      </w:pPr>
-      <w:r>
-        <w:t>detect_bench(port: int = 5025, subnet: str = "") -&gt; list[str]</w:t>
-      </w:r>
-    </w:p>
-    <w:p>
-      <w:r>
-        <w:t>Detect and open every instrument on the bench with the right driver.</w:t>
       </w:r>
     </w:p>
     <w:p>
@@ -2675,6 +2658,32 @@
         <w:t xml:space="preserve">Returns: </w:t>
       </w:r>
       <w:r>
+        <w:t>str - the *IDN?, or "" if nothing matched.</w:t>
+      </w:r>
+    </w:p>
+    <w:p/>
+    <w:p>
+      <w:pPr>
+        <w:pStyle w:val="Mono"/>
+        <w:spacing w:after="40"/>
+      </w:pPr>
+      <w:r>
+        <w:t>detect_bench(port: int = 5025, subnet: str = "") -&gt; list[str]</w:t>
+      </w:r>
+    </w:p>
+    <w:p>
+      <w:r>
+        <w:t>Detect and open every instrument on the bench with the right driver.</w:t>
+      </w:r>
+    </w:p>
+    <w:p>
+      <w:r>
+        <w:rPr>
+          <w:b/>
+        </w:rPr>
+        <w:t xml:space="preserve">Returns: </w:t>
+      </w:r>
+      <w:r>
         <w:t>list of str - the aliases created.</w:t>
       </w:r>
     </w:p>
@@ -2859,34 +2868,8 @@
     </w:p>
     <w:p>
       <w:r>
+        <w:lastRenderedPageBreak/>
         <w:t>True RMS volts (any shape).</w:t>
-      </w:r>
-    </w:p>
-    <w:p>
-      <w:r>
-        <w:rPr>
-          <w:b/>
-        </w:rPr>
-        <w:lastRenderedPageBreak/>
-        <w:t xml:space="preserve">Returns: </w:t>
-      </w:r>
-      <w:r>
-        <w:t>float - volts.</w:t>
-      </w:r>
-    </w:p>
-    <w:p/>
-    <w:p>
-      <w:pPr>
-        <w:pStyle w:val="Mono"/>
-        <w:spacing w:after="40"/>
-      </w:pPr>
-      <w:r>
-        <w:t>scope_mean(alias, channel: int = 1) -&gt; float</w:t>
-      </w:r>
-    </w:p>
-    <w:p>
-      <w:r>
-        <w:t>Average volts - the DC level.</w:t>
       </w:r>
     </w:p>
     <w:p>
@@ -2907,12 +2890,12 @@
         <w:spacing w:after="40"/>
       </w:pPr>
       <w:r>
-        <w:t>scope_vmax / scope_vmin(alias, channel: int = 1) -&gt; float</w:t>
-      </w:r>
-    </w:p>
-    <w:p>
-      <w:r>
-        <w:t>Maximum / minimum volts (their difference is Vpp).</w:t>
+        <w:t>scope_mean(alias, channel: int = 1) -&gt; float</w:t>
+      </w:r>
+    </w:p>
+    <w:p>
+      <w:r>
+        <w:t>Average volts - the DC level.</w:t>
       </w:r>
     </w:p>
     <w:p>
@@ -2933,12 +2916,12 @@
         <w:spacing w:after="40"/>
       </w:pPr>
       <w:r>
-        <w:t>scope_pulse_width(alias, channel: int = 1) -&gt; float</w:t>
-      </w:r>
-    </w:p>
-    <w:p>
-      <w:r>
-        <w:t>Positive (high) pulse width, seconds.</w:t>
+        <w:t>scope_vmax / scope_vmin(alias, channel: int = 1) -&gt; float</w:t>
+      </w:r>
+    </w:p>
+    <w:p>
+      <w:r>
+        <w:t>Maximum / minimum volts (their difference is Vpp).</w:t>
       </w:r>
     </w:p>
     <w:p>
@@ -2949,7 +2932,7 @@
         <w:t xml:space="preserve">Returns: </w:t>
       </w:r>
       <w:r>
-        <w:t>float - seconds. 0.0 if flat.</w:t>
+        <w:t>float - volts.</w:t>
       </w:r>
     </w:p>
     <w:p/>
@@ -2959,12 +2942,12 @@
         <w:spacing w:after="40"/>
       </w:pPr>
       <w:r>
-        <w:t>scope_pulse_width_negative(alias, channel: int = 1) -&gt; float</w:t>
-      </w:r>
-    </w:p>
-    <w:p>
-      <w:r>
-        <w:t>Negative (low) pulse width, seconds.</w:t>
+        <w:t>scope_pulse_width(alias, channel: int = 1) -&gt; float</w:t>
+      </w:r>
+    </w:p>
+    <w:p>
+      <w:r>
+        <w:t>Positive (high) pulse width, seconds.</w:t>
       </w:r>
     </w:p>
     <w:p>
@@ -2981,26 +2964,16 @@
     <w:p/>
     <w:p>
       <w:pPr>
-        <w:pStyle w:val="Heading2"/>
-      </w:pPr>
-      <w:bookmarkStart w:id="17" w:name="_Toc236223462"/>
-      <w:r>
-        <w:t>5.4 Scope: save</w:t>
-      </w:r>
-      <w:bookmarkEnd w:id="17"/>
-    </w:p>
-    <w:p>
-      <w:pPr>
         <w:pStyle w:val="Mono"/>
         <w:spacing w:after="40"/>
       </w:pPr>
       <w:r>
-        <w:t>save_scope_png(alias: str, path: str) -&gt; str</w:t>
-      </w:r>
-    </w:p>
-    <w:p>
-      <w:r>
-        <w:t>Save a PNG of the captured data; the alias goes in the file name AND the plot title.</w:t>
+        <w:t>scope_pulse_width_negative(alias, channel: int = 1) -&gt; float</w:t>
+      </w:r>
+    </w:p>
+    <w:p>
+      <w:r>
+        <w:t>Negative (low) pulse width, seconds.</w:t>
       </w:r>
     </w:p>
     <w:p>
@@ -3011,22 +2984,32 @@
         <w:t xml:space="preserve">Returns: </w:t>
       </w:r>
       <w:r>
-        <w:t>str - path(s) written. Raises RuntimeError if nothing captured for that scope.</w:t>
+        <w:t>float - seconds. 0.0 if flat.</w:t>
       </w:r>
     </w:p>
     <w:p/>
+    <w:p>
+      <w:pPr>
+        <w:pStyle w:val="Heading2"/>
+      </w:pPr>
+      <w:bookmarkStart w:id="17" w:name="_Toc236223462"/>
+      <w:r>
+        <w:t>5.4 Scope: save</w:t>
+      </w:r>
+      <w:bookmarkEnd w:id="17"/>
+    </w:p>
     <w:p>
       <w:pPr>
         <w:pStyle w:val="Mono"/>
         <w:spacing w:after="40"/>
       </w:pPr>
       <w:r>
-        <w:t>save_scope_csv(alias: str, path: str) -&gt; str</w:t>
-      </w:r>
-    </w:p>
-    <w:p>
-      <w:r>
-        <w:t>Save the captured data as CSV, alias in the file name.</w:t>
+        <w:t>save_scope_png(alias: str, path: str) -&gt; str</w:t>
+      </w:r>
+    </w:p>
+    <w:p>
+      <w:r>
+        <w:t>Save a PNG of the captured data; the alias goes in the file name AND the plot title.</w:t>
       </w:r>
     </w:p>
     <w:p>
@@ -3037,6 +3020,32 @@
         <w:t xml:space="preserve">Returns: </w:t>
       </w:r>
       <w:r>
+        <w:t>str - path(s) written. Raises RuntimeError if nothing captured for that scope.</w:t>
+      </w:r>
+    </w:p>
+    <w:p/>
+    <w:p>
+      <w:pPr>
+        <w:pStyle w:val="Mono"/>
+        <w:spacing w:after="40"/>
+      </w:pPr>
+      <w:r>
+        <w:t>save_scope_csv(alias: str, path: str) -&gt; str</w:t>
+      </w:r>
+    </w:p>
+    <w:p>
+      <w:r>
+        <w:t>Save the captured data as CSV, alias in the file name.</w:t>
+      </w:r>
+    </w:p>
+    <w:p>
+      <w:r>
+        <w:rPr>
+          <w:b/>
+        </w:rPr>
+        <w:t xml:space="preserve">Returns: </w:t>
+      </w:r>
+      <w:r>
         <w:t>str - path(s) written.</w:t>
       </w:r>
     </w:p>
@@ -3413,16 +3422,7 @@
         <w:t xml:space="preserve">    Configuring a waveform does not enable the output. Call function_gen_output_on().</w:t>
       </w:r>
     </w:p>
-    <w:p>
-      <w:r>
-        <w:t>A 20-minute (ecm_20min) capture fails on the Keysight</w:t>
-      </w:r>
-    </w:p>
-    <w:p>
-      <w:r>
-        <w:t xml:space="preserve">    120 s/div exceeds the Keysight's 50 s/div limit. Use the Tektronix MSO24 for it.</w:t>
-      </w:r>
-    </w:p>
+    <w:p/>
     <w:sectPr>
       <w:pgSz w:w="12240" w:h="15840"/>
       <w:pgMar w:top="1440" w:right="1800" w:bottom="1440" w:left="1800" w:header="720" w:footer="720" w:gutter="0"/>

</xml_diff>